<commit_message>
chore: update it_activities.docx file
</commit_message>
<xml_diff>
--- a/src/assets/docs/it_activities.docx
+++ b/src/assets/docs/it_activities.docx
@@ -1,7 +1,109 @@
 
 <file path=word/document.xml><?xml version="1.0" encoding="utf-8"?>
-<w:document xmlns:wpc="http://schemas.microsoft.com/office/word/2010/wordprocessingCanvas" xmlns:cx="http://schemas.microsoft.com/office/drawing/2014/chartex" xmlns:cx1="http://schemas.microsoft.com/office/drawing/2015/9/8/chartex" xmlns:cx2="http://schemas.microsoft.com/office/drawing/2015/10/21/chartex" xmlns:cx3="http://schemas.microsoft.com/office/drawing/2016/5/9/chartex" xmlns:cx4="http://schemas.microsoft.com/office/drawing/2016/5/10/chartex" xmlns:cx5="http://schemas.microsoft.com/office/drawing/2016/5/11/chartex" xmlns:cx6="http://schemas.microsoft.com/office/drawing/2016/5/12/chartex" xmlns:cx7="http://schemas.microsoft.com/office/drawing/2016/5/13/chartex" xmlns:cx8="http://schemas.microsoft.com/office/drawing/2016/5/14/chartex" xmlns:mc="http://schemas.openxmlformats.org/markup-compatibility/2006" xmlns:aink="http://schemas.microsoft.com/office/drawing/2016/ink" xmlns:am3d="http://schemas.microsoft.com/office/drawing/2017/model3d" xmlns:o="urn:schemas-microsoft-com:office:office" xmlns:r="http://schemas.openxmlformats.org/officeDocument/2006/relationships" xmlns:m="http://schemas.openxmlformats.org/officeDocument/2006/math" xmlns:v="urn:schemas-microsoft-com:vml" xmlns:wp14="http://schemas.microsoft.com/office/word/2010/wordprocessingDrawing" xmlns:wp="http://schemas.openxmlformats.org/drawingml/2006/wordprocessingDrawing" xmlns:w10="urn:schemas-microsoft-com:office:word" xmlns:w="http://schemas.openxmlformats.org/wordprocessingml/2006/main" xmlns:w14="http://schemas.microsoft.com/office/word/2010/wordml" xmlns:w15="http://schemas.microsoft.com/office/word/2012/wordml" xmlns:w16cex="http://schemas.microsoft.com/office/word/2018/wordml/cex" xmlns:w16cid="http://schemas.microsoft.com/office/word/2016/wordml/cid" xmlns:w16="http://schemas.microsoft.com/office/word/2018/wordml" xmlns:w16sdtdh="http://schemas.microsoft.com/office/word/2020/wordml/sdtdatahash" xmlns:w16se="http://schemas.microsoft.com/office/word/2015/wordml/symex" xmlns:wpg="http://schemas.microsoft.com/office/word/2010/wordprocessingGroup" xmlns:wpi="http://schemas.microsoft.com/office/word/2010/wordprocessingInk" xmlns:wne="http://schemas.microsoft.com/office/word/2006/wordml" xmlns:wps="http://schemas.microsoft.com/office/word/2010/wordprocessingShape" mc:Ignorable="w14 w15 w16se w16cid w16 w16cex w16sdtdh wp14">
+<w:document xmlns:wpc="http://schemas.microsoft.com/office/word/2010/wordprocessingCanvas" xmlns:cx="http://schemas.microsoft.com/office/drawing/2014/chartex" xmlns:cx1="http://schemas.microsoft.com/office/drawing/2015/9/8/chartex" xmlns:cx2="http://schemas.microsoft.com/office/drawing/2015/10/21/chartex" xmlns:cx3="http://schemas.microsoft.com/office/drawing/2016/5/9/chartex" xmlns:cx4="http://schemas.microsoft.com/office/drawing/2016/5/10/chartex" xmlns:cx5="http://schemas.microsoft.com/office/drawing/2016/5/11/chartex" xmlns:cx6="http://schemas.microsoft.com/office/drawing/2016/5/12/chartex" xmlns:cx7="http://schemas.microsoft.com/office/drawing/2016/5/13/chartex" xmlns:cx8="http://schemas.microsoft.com/office/drawing/2016/5/14/chartex" xmlns:mc="http://schemas.openxmlformats.org/markup-compatibility/2006" xmlns:aink="http://schemas.microsoft.com/office/drawing/2016/ink" xmlns:am3d="http://schemas.microsoft.com/office/drawing/2017/model3d" xmlns:o="urn:schemas-microsoft-com:office:office" xmlns:oel="http://schemas.microsoft.com/office/2019/extlst" xmlns:r="http://schemas.openxmlformats.org/officeDocument/2006/relationships" xmlns:m="http://schemas.openxmlformats.org/officeDocument/2006/math" xmlns:v="urn:schemas-microsoft-com:vml" xmlns:wp14="http://schemas.microsoft.com/office/word/2010/wordprocessingDrawing" xmlns:wp="http://schemas.openxmlformats.org/drawingml/2006/wordprocessingDrawing" xmlns:w10="urn:schemas-microsoft-com:office:word" xmlns:w="http://schemas.openxmlformats.org/wordprocessingml/2006/main" xmlns:w14="http://schemas.microsoft.com/office/word/2010/wordml" xmlns:w15="http://schemas.microsoft.com/office/word/2012/wordml" xmlns:w16cex="http://schemas.microsoft.com/office/word/2018/wordml/cex" xmlns:w16cid="http://schemas.microsoft.com/office/word/2016/wordml/cid" xmlns:w16="http://schemas.microsoft.com/office/word/2018/wordml" xmlns:w16sdtdh="http://schemas.microsoft.com/office/word/2020/wordml/sdtdatahash" xmlns:w16se="http://schemas.microsoft.com/office/word/2015/wordml/symex" xmlns:wpg="http://schemas.microsoft.com/office/word/2010/wordprocessingGroup" xmlns:wpi="http://schemas.microsoft.com/office/word/2010/wordprocessingInk" xmlns:wne="http://schemas.microsoft.com/office/word/2006/wordml" xmlns:wps="http://schemas.microsoft.com/office/word/2010/wordprocessingShape" mc:Ignorable="w14 w15 w16se w16cid w16 w16cex w16sdtdh wp14">
   <w:body>
+    <w:p>
+      <w:pPr>
+        <w:tabs>
+          <w:tab w:val="left" w:pos="9637"/>
+        </w:tabs>
+        <w:ind w:left="-426" w:right="284"/>
+        <w:rPr>
+          <w:rFonts w:ascii="PT Serif" w:hAnsi="PT Serif" w:cs="PT Serif"/>
+          <w:b/>
+          <w:bCs/>
+          <w:color w:val="000000"/>
+          <w:sz w:val="24"/>
+          <w:szCs w:val="24"/>
+        </w:rPr>
+      </w:pPr>
+      <w:r>
+        <w:rPr>
+          <w:rFonts w:ascii="PT Serif" w:hAnsi="PT Serif" w:cs="PT Serif"/>
+          <w:b/>
+          <w:bCs/>
+          <w:color w:val="000000"/>
+          <w:sz w:val="24"/>
+          <w:szCs w:val="24"/>
+        </w:rPr>
+        <w:t>ОКВЭД</w:t>
+      </w:r>
+    </w:p>
+    <w:p>
+      <w:pPr>
+        <w:tabs>
+          <w:tab w:val="left" w:pos="9637"/>
+        </w:tabs>
+        <w:ind w:left="709" w:right="284"/>
+        <w:rPr>
+          <w:color w:val="000000"/>
+          <w:sz w:val="24"/>
+          <w:szCs w:val="24"/>
+        </w:rPr>
+      </w:pPr>
+      <w:r>
+        <w:rPr>
+          <w:bCs/>
+          <w:color w:val="000000"/>
+          <w:sz w:val="24"/>
+          <w:szCs w:val="24"/>
+        </w:rPr>
+        <w:br/>
+      </w:r>
+      <w:r>
+        <w:rPr>
+          <w:bCs/>
+          <w:color w:val="000000"/>
+          <w:sz w:val="24"/>
+          <w:szCs w:val="24"/>
+        </w:rPr>
+        <w:t>6</w:t>
+      </w:r>
+      <w:r>
+        <w:rPr>
+          <w:bCs/>
+          <w:color w:val="000000"/>
+          <w:sz w:val="24"/>
+          <w:szCs w:val="24"/>
+        </w:rPr>
+        <w:t>2.01</w:t>
+      </w:r>
+      <w:r>
+        <w:rPr>
+          <w:b/>
+          <w:color w:val="000000"/>
+          <w:sz w:val="24"/>
+          <w:szCs w:val="24"/>
+        </w:rPr>
+        <w:t xml:space="preserve"> </w:t>
+      </w:r>
+      <w:r>
+        <w:rPr>
+          <w:bCs/>
+          <w:color w:val="000000"/>
+          <w:sz w:val="24"/>
+          <w:szCs w:val="24"/>
+        </w:rPr>
+        <w:t>Разработка компьютерного программного обеспечения</w:t>
+      </w:r>
+      <w:r>
+        <w:rPr>
+          <w:color w:val="000000"/>
+          <w:sz w:val="24"/>
+          <w:szCs w:val="24"/>
+        </w:rPr>
+        <w:t xml:space="preserve">; </w:t>
+      </w:r>
+    </w:p>
+    <w:p>
+      <w:pPr>
+        <w:pStyle w:val="Default"/>
+        <w:ind w:left="709"/>
+      </w:pPr>
+      <w:r>
+        <w:t>46.49.49; 46.51.2; 46.52.1;46.52.2; 46.90; 59.11; 59.12; 62.02; 62.09; 63.11; 63.11.1; 63.11.9; 68.20.2; 73.11; 74.20; 77.21; 77.29.1; 77.29.2; 77.29.9; 77.33.1; 77.33.2; 77.39.2; 77.39.24; 77.39.29; 82.30; 82.99; 95.11</w:t>
+      </w:r>
+    </w:p>
     <w:p>
       <w:pPr>
         <w:pStyle w:val="Default"/>
@@ -29,12 +131,6 @@
         <w:gridCol w:w="9640"/>
       </w:tblGrid>
       <w:tr>
-        <w:tblPrEx>
-          <w:tblCellMar>
-            <w:top w:w="0" w:type="dxa"/>
-            <w:bottom w:w="0" w:type="dxa"/>
-          </w:tblCellMar>
-        </w:tblPrEx>
         <w:trPr>
           <w:trHeight w:val="123"/>
         </w:trPr>
@@ -69,14 +165,7 @@
                 <w:b/>
                 <w:bCs/>
               </w:rPr>
-              <w:t xml:space="preserve"> деятельности в области информационных технологий</w:t>
-            </w:r>
-            <w:r>
-              <w:rPr>
-                <w:b/>
-                <w:bCs/>
-              </w:rPr>
-              <w:t>:</w:t>
+              <w:t xml:space="preserve"> деятельности в области информационных технологий:</w:t>
             </w:r>
           </w:p>
           <w:p>
@@ -101,12 +190,6 @@
               <w:gridCol w:w="8381"/>
             </w:tblGrid>
             <w:tr>
-              <w:tblPrEx>
-                <w:tblCellMar>
-                  <w:top w:w="0" w:type="dxa"/>
-                  <w:bottom w:w="0" w:type="dxa"/>
-                </w:tblCellMar>
-              </w:tblPrEx>
               <w:trPr>
                 <w:trHeight w:val="240"/>
               </w:trPr>
@@ -124,71 +207,27 @@
                     <w:jc w:val="both"/>
                   </w:pPr>
                   <w:r>
-                    <w:t>Проектирование, и (или) обследование, и (или) разработка, и (или) адаптация, и (или)модификация (в том числе локализация, кастомизация, доработка), и (или) модернизация,(или) обновление, и (или) установка, и (или) интеграция, и (или) настройка и (или)конфигурирование, и (или) внедрение, и (или) сопровождение, и (или) тестирование, и (или)испытания, и (или) техническая поддержка, и (или) эксплуатация, включая</w:t>
+                    <w:rPr>
+                      <w:highlight w:val="lightGray"/>
+                    </w:rPr>
+                    <w:t>1.01</w:t>
                   </w:r>
                   <w:r>
                     <w:t xml:space="preserve"> </w:t>
                   </w:r>
                   <w:r>
-                    <w:t>администрирование, а также оказание услуг (в том числе</w:t>
-                  </w:r>
-                  <w:r>
-                    <w:t xml:space="preserve"> </w:t>
-                  </w:r>
-                  <w:r>
-                    <w:t>консультационных, услуг по</w:t>
-                  </w:r>
-                  <w:r>
-                    <w:t xml:space="preserve"> </w:t>
-                  </w:r>
-                  <w:r>
-                    <w:t>обучению, экспертных услуг и иных) в области проектирования, (или) обследования, и (или)разработки, и (или) адаптации, и (или) модификации (в том числе локализации,</w:t>
-                  </w:r>
-                  <w:r>
-                    <w:t xml:space="preserve"> </w:t>
-                  </w:r>
-                  <w:r>
-                    <w:t>кастомизации, доработки), и (или) обратного проектирования (реверсивного инжиниринга),и (или) модернизации, и (или) обновления, и (или) установки, и (или) интеграция, и (или)настройки и (или) конфигурирования, и (или) внедрения, и (или) сопровождения, и (или)тестирования, и (или) испытания, и (или)</w:t>
-                  </w:r>
-                  <w:r>
-                    <w:t xml:space="preserve"> </w:t>
-                  </w:r>
-                  <w:r>
-                    <w:t>технической поддержки, и (или) эксплуатации</w:t>
-                  </w:r>
-                  <w:r>
-                    <w:t xml:space="preserve"> </w:t>
-                  </w:r>
-                  <w:r>
-                    <w:t>(далее - Проектирование и (или) иная деятельность, а также оказание консультационных и</w:t>
-                  </w:r>
-                  <w:r>
-                    <w:t xml:space="preserve"> </w:t>
-                  </w:r>
-                  <w:r>
-                    <w:t>экспертных услуг), в отношении</w:t>
-                  </w:r>
-                  <w:r>
-                    <w:t xml:space="preserve"> </w:t>
-                  </w:r>
-                  <w:r>
-                    <w:t>программ для электронных вычислительных машин (далее -программы для ЭВМ), и (или) баз данных (в том числе их обновлений и исправлений), и (или)визуальных пользовательских интерфейсов независимо от класса и вида программного</w:t>
-                  </w:r>
-                  <w:r>
-                    <w:t xml:space="preserve"> </w:t>
-                  </w:r>
-                  <w:r>
-                    <w:t>обеспечения, включая специализированные программы для ЭВМ и базы данных,</w:t>
-                  </w:r>
-                  <w:r>
-                    <w:t xml:space="preserve"> </w:t>
-                  </w:r>
-                  <w:r>
-                    <w:t>компьютерные игры, а также вида договоров, по которым эта деятельность осуществляется</w:t>
+                    <w:t>Проектирование, и (или) обследование, и (или) разработка, и (или) адаптация, и (или) модификация (в том числе локализация, кастомизация, доработка), и (или) обратное проектирование (реверсивный инжиниринг), и (или) модернизация, и (или) обновление, и (или) установка, и (или) интеграция, и (или) настройка, и (или) конфигурирование, и (или) внедрение, и (или) сопровождение, и (или) тестирование, и (или) испытания, и (или) техническая поддержка, и (или) эксплуатация, включая администрирование, а также оказание услуг (в том числе консультационных, услуг по обучению, экспертных услуг и иных) в указанных видах деятельности (далее - проектирование и (или) иная деятельность, а также оказание услуг), в отношении программ для электронных вычислительных машин (далее - программы для ЭВМ), и (или) баз данных (в том числе их обновлений и исправлений), и (или) визуальных пользовательских интерфейсов</w:t>
                   </w:r>
                   <w:r>
                     <w:t>;</w:t>
                   </w:r>
+                </w:p>
+                <w:p>
+                  <w:pPr>
+                    <w:pStyle w:val="Default"/>
+                    <w:ind w:left="907"/>
+                    <w:jc w:val="both"/>
+                  </w:pPr>
                 </w:p>
                 <w:p>
                   <w:pPr>
@@ -200,6 +239,15 @@
                     <w:jc w:val="both"/>
                   </w:pPr>
                   <w:r>
+                    <w:rPr>
+                      <w:highlight w:val="lightGray"/>
+                    </w:rPr>
+                    <w:t>1.05</w:t>
+                  </w:r>
+                  <w:r>
+                    <w:t xml:space="preserve"> </w:t>
+                  </w:r>
+                  <w:r>
                     <w:t>Проектирование и (или) иная деятельность, а также оказание консультационных и</w:t>
                   </w:r>
                   <w:r>
@@ -217,6 +265,13 @@
                   <w:r>
                     <w:t>;</w:t>
                   </w:r>
+                </w:p>
+                <w:p>
+                  <w:pPr>
+                    <w:pStyle w:val="Default"/>
+                    <w:ind w:left="907"/>
+                    <w:jc w:val="both"/>
+                  </w:pPr>
                 </w:p>
                 <w:p>
                   <w:pPr>
@@ -228,23 +283,54 @@
                     <w:jc w:val="both"/>
                   </w:pPr>
                   <w:r>
-                    <w:t>Проектирование и (или) иная деятельность, а также оказание консультационных иэ</w:t>
+                    <w:rPr>
+                      <w:highlight w:val="lightGray"/>
+                    </w:rPr>
+                    <w:t>1.0</w:t>
+                  </w:r>
+                  <w:r>
+                    <w:rPr>
+                      <w:highlight w:val="lightGray"/>
+                    </w:rPr>
+                    <w:t>7</w:t>
                   </w:r>
                   <w:r>
                     <w:t xml:space="preserve"> </w:t>
                   </w:r>
                   <w:r>
-                    <w:t>кспертных услуг в отношении 2D и 3D-моделей и визуализаций (в том числе BIM-моделей),</w:t>
-                  </w:r>
+                    <w:t xml:space="preserve">Проектирование и (или) иная деятельность, а также оказание консультационных </w:t>
+                  </w:r>
+                  <w:proofErr w:type="spellStart"/>
+                  <w:r>
+                    <w:t>иэ</w:t>
+                  </w:r>
+                  <w:proofErr w:type="spellEnd"/>
                   <w:r>
                     <w:t xml:space="preserve"> </w:t>
                   </w:r>
+                  <w:proofErr w:type="spellStart"/>
+                  <w:r>
+                    <w:t>кспертных</w:t>
+                  </w:r>
+                  <w:proofErr w:type="spellEnd"/>
+                  <w:r>
+                    <w:t xml:space="preserve"> услуг в отношении 2D и 3D-моделей и визуализаций (в том числе BIM-моделей),</w:t>
+                  </w:r>
+                  <w:r>
+                    <w:t xml:space="preserve"> </w:t>
+                  </w:r>
                   <w:r>
                     <w:t>цифровых копий физического объекта или процесса</w:t>
                   </w:r>
                   <w:r>
                     <w:t>;</w:t>
                   </w:r>
+                </w:p>
+                <w:p>
+                  <w:pPr>
+                    <w:pStyle w:val="Default"/>
+                    <w:jc w:val="both"/>
+                  </w:pPr>
                 </w:p>
                 <w:p>
                   <w:pPr>
@@ -256,11 +342,62 @@
                     <w:jc w:val="both"/>
                   </w:pPr>
                   <w:r>
-                    <w:t>Деятельность по созданию, развитию и обеспечению функционирования порталов и (или)систем поиска в информационно-коммуникационной сети Интернет</w:t>
+                    <w:rPr>
+                      <w:highlight w:val="lightGray"/>
+                    </w:rPr>
+                    <w:t>3.01</w:t>
+                  </w:r>
+                  <w:r>
+                    <w:t xml:space="preserve"> </w:t>
+                  </w:r>
+                  <w:r>
+                    <w:t>Деятельность по созданию баз данных и информационных ресурсов (включая разработку концепций, структуры, состава баз данных), формированию и ведению баз данных (включая сбор данных из одного или более источников, а также ввод, верификацию и актуализацию данных), администрированию баз данных (включая обеспечение возможности доступа к базе данных в режиме непосредственного или телекоммуникационного доступа), поиску данных, их отбору и сортировке по запросам, предоставлению отобранных данных пользователям</w:t>
                   </w:r>
                   <w:r>
                     <w:t>;</w:t>
                   </w:r>
+                </w:p>
+                <w:p>
+                  <w:pPr>
+                    <w:pStyle w:val="Default"/>
+                    <w:numPr>
+                      <w:ilvl w:val="0"/>
+                      <w:numId w:val="2"/>
+                    </w:numPr>
+                    <w:tabs>
+                      <w:tab w:val="left" w:pos="1628"/>
+                    </w:tabs>
+                    <w:jc w:val="both"/>
+                  </w:pPr>
+                  <w:r>
+                    <w:rPr>
+                      <w:highlight w:val="lightGray"/>
+                    </w:rPr>
+                    <w:lastRenderedPageBreak/>
+                    <w:t>9</w:t>
+                  </w:r>
+                  <w:r>
+                    <w:rPr>
+                      <w:highlight w:val="lightGray"/>
+                    </w:rPr>
+                    <w:t>.01</w:t>
+                  </w:r>
+                  <w:r>
+                    <w:t xml:space="preserve"> </w:t>
+                  </w:r>
+                  <w:r>
+                    <w:t>Деятельность по созданию, развитию и обеспечению функционирования порталов и (или) систем поиска в информационно-телекоммуникационной сети "Интернет"</w:t>
+                  </w:r>
+                  <w:r>
+                    <w:t>;</w:t>
+                  </w:r>
+                </w:p>
+                <w:p>
+                  <w:pPr>
+                    <w:pStyle w:val="Default"/>
+                    <w:ind w:left="907"/>
+                    <w:jc w:val="both"/>
+                  </w:pPr>
                 </w:p>
                 <w:p>
                   <w:pPr>
@@ -272,117 +409,37 @@
                     <w:jc w:val="both"/>
                   </w:pPr>
                   <w:r>
-                    <w:t>Деятельность по созданию, реализации и (или) изданию компьютерных игр и (или) видеоигр</w:t>
-                  </w:r>
-                  <w:r>
                     <w:t xml:space="preserve"> </w:t>
                   </w:r>
                   <w:r>
-                    <w:t>(мультимедийного продукта, базирующегося на взаимодействии человека и ЭВМ</w:t>
+                    <w:rPr>
+                      <w:highlight w:val="lightGray"/>
+                    </w:rPr>
+                    <w:t>22.01</w:t>
                   </w:r>
                   <w:r>
                     <w:t xml:space="preserve"> </w:t>
                   </w:r>
                   <w:r>
-                    <w:t>посредством визуального интерфейса), продажи внутриигровых предметов компьютерных</w:t>
-                  </w:r>
-                  <w:r>
-                    <w:t xml:space="preserve"> </w:t>
-                  </w:r>
-                  <w:r>
-                    <w:t>игр и (или) видеоигр, в том числе деятельность по созданию виртуальных миров и</w:t>
-                  </w:r>
-                  <w:r>
-                    <w:t xml:space="preserve"> </w:t>
-                  </w:r>
-                  <w:r>
-                    <w:t xml:space="preserve">пространства, включая графическую визуализацию, дизайн и </w:t>
-                  </w:r>
-                  <w:r>
-                    <w:lastRenderedPageBreak/>
-                    <w:t>симуляцию поведения;</w:t>
-                  </w:r>
-                  <w:r>
-                    <w:t xml:space="preserve"> </w:t>
-                  </w:r>
-                  <w:r>
-                    <w:t>оказание услуг по созданию технологий захвата движений и фотограмметрии,</w:t>
-                  </w:r>
-                  <w:r>
-                    <w:t xml:space="preserve"> </w:t>
-                  </w:r>
-                  <w:r>
-                    <w:t>включая</w:t>
-                  </w:r>
-                  <w:r>
-                    <w:t xml:space="preserve"> </w:t>
-                  </w:r>
-                  <w:r>
-                    <w:t>трехмерных моделей объектов и ландшафтов; оптимизации быстродействия; портированию(модификации в целях функционирования на отличных от целевой платформах)компьютерных игр и (или) видеоигр; синтезу изображений и виртуальных материалов для</w:t>
-                  </w:r>
-                  <w:r>
-                    <w:t xml:space="preserve"> </w:t>
-                  </w:r>
-                  <w:r>
-                    <w:t>использования в компьютерных играх и (или) видеоиграх; разработке алгоритмов теории</w:t>
-                  </w:r>
-                  <w:r>
-                    <w:t xml:space="preserve"> </w:t>
-                  </w:r>
-                  <w:r>
-                    <w:t>управления, эвристических алгоритмов и скриптов поведения в игровом искусственном</w:t>
-                  </w:r>
-                  <w:r>
-                    <w:t xml:space="preserve"> </w:t>
-                  </w:r>
-                  <w:r>
-                    <w:t>интеллекте, научно-исследовательской работе в</w:t>
-                  </w:r>
-                  <w:r>
-                    <w:t xml:space="preserve"> </w:t>
-                  </w:r>
-                  <w:r>
-                    <w:t>области компьютерных игр и (или) видеоигр,</w:t>
-                  </w:r>
-                  <w:r>
-                    <w:t xml:space="preserve"> </w:t>
-                  </w:r>
-                  <w:r>
-                    <w:t>определения паттернов поведения пользователей компьютерных игр, видеоигр и</w:t>
-                  </w:r>
-                  <w:r>
-                    <w:t xml:space="preserve"> </w:t>
-                  </w:r>
-                  <w:r>
-                    <w:t>электронных симуляторов, разработке и</w:t>
-                  </w:r>
-                  <w:r>
-                    <w:t xml:space="preserve"> </w:t>
-                  </w:r>
-                  <w:r>
-                    <w:t>интеграции в компьютерные игры и (или)видеоигры 2D и 3D-анимированию объектов (включая скелетные анимации и анимации на</w:t>
-                  </w:r>
-                  <w:r>
-                    <w:t xml:space="preserve"> </w:t>
-                  </w:r>
-                  <w:r>
-                    <w:t>основе материалов motion capture), разработке иной игровой мультимедийной продукции, в</w:t>
-                  </w:r>
-                  <w:r>
-                    <w:t xml:space="preserve"> </w:t>
-                  </w:r>
-                  <w:r>
-                    <w:t>том числе с использованием аудио</w:t>
-                  </w:r>
-                  <w:r>
-                    <w:t xml:space="preserve"> </w:t>
-                  </w:r>
-                  <w:r>
-                    <w:t>интерфейсов, для лиц с ограниченными возможностями</w:t>
+                    <w:t xml:space="preserve">Деятельность по созданию, реализации и (или) изданию видеоигр (мультимедийного продукта, базирующегося на взаимодействии человека и программ для ЭВМ посредством визуального интерфейса), продаже внутриигровых предметов видеоигр, в том числе деятельность по созданию виртуальных миров и пространства, включая графическую визуализацию, дизайн и симуляцию поведения; оказание услуг по созданию технологий захвата движений и фотограмметрии, включая трехмерные модели объектов и ландшафтов; оптимизации быстродействия; портированию (модификации в целях функционирования на отличных от целевой платформах) видеоигр; синтезу изображений и виртуальных материалов для использования в видеоиграх; разработке алгоритмов теории управления, эвристических алгоритмов и скриптов поведения в игровом искусственном интеллекте, научно-исследовательской работе в области видеоигр, определения паттернов поведения пользователей видеоигр и электронных симуляторов, разработке и интеграции в видеоигры 2D и 3D-анимирования объектов (включая скелетные анимации и анимации на основе материалов захвата движения), разработке иной игровой мультимедийной продукции, в том числе с использованием </w:t>
+                  </w:r>
+                  <w:proofErr w:type="spellStart"/>
+                  <w:r>
+                    <w:t>аудиоинтерфейсов</w:t>
+                  </w:r>
+                  <w:proofErr w:type="spellEnd"/>
+                  <w:r>
+                    <w:t xml:space="preserve"> для лиц с ограниченными возможностями</w:t>
                   </w:r>
                   <w:r>
                     <w:t>;</w:t>
                   </w:r>
+                </w:p>
+                <w:p>
+                  <w:pPr>
+                    <w:pStyle w:val="Default"/>
+                    <w:jc w:val="both"/>
+                  </w:pPr>
                 </w:p>
                 <w:p>
                   <w:pPr>
@@ -394,16 +451,19 @@
                     <w:jc w:val="both"/>
                   </w:pPr>
                   <w:r>
-                    <w:t>Торговля (поставка) розничная и оптовая ПАК и оборудованием, его компонентами,</w:t>
+                    <w:rPr>
+                      <w:highlight w:val="lightGray"/>
+                    </w:rPr>
+                    <w:t>27.01</w:t>
                   </w:r>
                   <w:r>
                     <w:t xml:space="preserve"> </w:t>
                   </w:r>
                   <w:r>
-                    <w:t>оборудованием ИТ-инфраструктуры, предоставления в лизинг, аренду (прокат</w:t>
-                  </w:r>
-                  <w:r>
-                    <w:t>).</w:t>
+                    <w:t>Торговля (поставка) розничная и оптовая ПАК и оборудованием, его компонентами, оборудованием ИТ-инфраструктуры, предоставление в лизинг, аренду (прокат) ПАК и оборудования, его компонентов, оборудования ИТ-инфраструктуры</w:t>
+                  </w:r>
+                  <w:r>
+                    <w:t>;</w:t>
                   </w:r>
                 </w:p>
                 <w:p>
@@ -455,7 +515,7 @@
 </file>
 
 <file path=word/numbering.xml><?xml version="1.0" encoding="utf-8"?>
-<w:numbering xmlns:wpc="http://schemas.microsoft.com/office/word/2010/wordprocessingCanvas" xmlns:cx="http://schemas.microsoft.com/office/drawing/2014/chartex" xmlns:cx1="http://schemas.microsoft.com/office/drawing/2015/9/8/chartex" xmlns:cx2="http://schemas.microsoft.com/office/drawing/2015/10/21/chartex" xmlns:cx3="http://schemas.microsoft.com/office/drawing/2016/5/9/chartex" xmlns:cx4="http://schemas.microsoft.com/office/drawing/2016/5/10/chartex" xmlns:cx5="http://schemas.microsoft.com/office/drawing/2016/5/11/chartex" xmlns:cx6="http://schemas.microsoft.com/office/drawing/2016/5/12/chartex" xmlns:cx7="http://schemas.microsoft.com/office/drawing/2016/5/13/chartex" xmlns:cx8="http://schemas.microsoft.com/office/drawing/2016/5/14/chartex" xmlns:mc="http://schemas.openxmlformats.org/markup-compatibility/2006" xmlns:aink="http://schemas.microsoft.com/office/drawing/2016/ink" xmlns:am3d="http://schemas.microsoft.com/office/drawing/2017/model3d" xmlns:o="urn:schemas-microsoft-com:office:office" xmlns:r="http://schemas.openxmlformats.org/officeDocument/2006/relationships" xmlns:m="http://schemas.openxmlformats.org/officeDocument/2006/math" xmlns:v="urn:schemas-microsoft-com:vml" xmlns:wp14="http://schemas.microsoft.com/office/word/2010/wordprocessingDrawing" xmlns:wp="http://schemas.openxmlformats.org/drawingml/2006/wordprocessingDrawing" xmlns:w10="urn:schemas-microsoft-com:office:word" xmlns:w="http://schemas.openxmlformats.org/wordprocessingml/2006/main" xmlns:w14="http://schemas.microsoft.com/office/word/2010/wordml" xmlns:w15="http://schemas.microsoft.com/office/word/2012/wordml" xmlns:w16cex="http://schemas.microsoft.com/office/word/2018/wordml/cex" xmlns:w16cid="http://schemas.microsoft.com/office/word/2016/wordml/cid" xmlns:w16="http://schemas.microsoft.com/office/word/2018/wordml" xmlns:w16sdtdh="http://schemas.microsoft.com/office/word/2020/wordml/sdtdatahash" xmlns:w16se="http://schemas.microsoft.com/office/word/2015/wordml/symex" xmlns:wpg="http://schemas.microsoft.com/office/word/2010/wordprocessingGroup" xmlns:wpi="http://schemas.microsoft.com/office/word/2010/wordprocessingInk" xmlns:wne="http://schemas.microsoft.com/office/word/2006/wordml" xmlns:wps="http://schemas.microsoft.com/office/word/2010/wordprocessingShape" mc:Ignorable="w14 w15 w16se w16cid w16 w16cex w16sdtdh wp14">
+<w:numbering xmlns:wpc="http://schemas.microsoft.com/office/word/2010/wordprocessingCanvas" xmlns:cx="http://schemas.microsoft.com/office/drawing/2014/chartex" xmlns:cx1="http://schemas.microsoft.com/office/drawing/2015/9/8/chartex" xmlns:cx2="http://schemas.microsoft.com/office/drawing/2015/10/21/chartex" xmlns:cx3="http://schemas.microsoft.com/office/drawing/2016/5/9/chartex" xmlns:cx4="http://schemas.microsoft.com/office/drawing/2016/5/10/chartex" xmlns:cx5="http://schemas.microsoft.com/office/drawing/2016/5/11/chartex" xmlns:cx6="http://schemas.microsoft.com/office/drawing/2016/5/12/chartex" xmlns:cx7="http://schemas.microsoft.com/office/drawing/2016/5/13/chartex" xmlns:cx8="http://schemas.microsoft.com/office/drawing/2016/5/14/chartex" xmlns:mc="http://schemas.openxmlformats.org/markup-compatibility/2006" xmlns:aink="http://schemas.microsoft.com/office/drawing/2016/ink" xmlns:am3d="http://schemas.microsoft.com/office/drawing/2017/model3d" xmlns:o="urn:schemas-microsoft-com:office:office" xmlns:oel="http://schemas.microsoft.com/office/2019/extlst" xmlns:r="http://schemas.openxmlformats.org/officeDocument/2006/relationships" xmlns:m="http://schemas.openxmlformats.org/officeDocument/2006/math" xmlns:v="urn:schemas-microsoft-com:vml" xmlns:wp14="http://schemas.microsoft.com/office/word/2010/wordprocessingDrawing" xmlns:wp="http://schemas.openxmlformats.org/drawingml/2006/wordprocessingDrawing" xmlns:w10="urn:schemas-microsoft-com:office:word" xmlns:w="http://schemas.openxmlformats.org/wordprocessingml/2006/main" xmlns:w14="http://schemas.microsoft.com/office/word/2010/wordml" xmlns:w15="http://schemas.microsoft.com/office/word/2012/wordml" xmlns:w16cex="http://schemas.microsoft.com/office/word/2018/wordml/cex" xmlns:w16cid="http://schemas.microsoft.com/office/word/2016/wordml/cid" xmlns:w16="http://schemas.microsoft.com/office/word/2018/wordml" xmlns:w16sdtdh="http://schemas.microsoft.com/office/word/2020/wordml/sdtdatahash" xmlns:w16se="http://schemas.microsoft.com/office/word/2015/wordml/symex" xmlns:wpg="http://schemas.microsoft.com/office/word/2010/wordprocessingGroup" xmlns:wpi="http://schemas.microsoft.com/office/word/2010/wordprocessingInk" xmlns:wne="http://schemas.microsoft.com/office/word/2006/wordml" xmlns:wps="http://schemas.microsoft.com/office/word/2010/wordprocessingShape" mc:Ignorable="w14 w15 w16se w16cid w16 w16cex w16sdtdh wp14">
   <w:abstractNum w:abstractNumId="0" w15:restartNumberingAfterBreak="0">
     <w:nsid w:val="23610C30"/>
     <w:multiLevelType w:val="multilevel"/>
@@ -658,10 +718,10 @@
       </w:pPr>
     </w:lvl>
   </w:abstractNum>
-  <w:num w:numId="1">
+  <w:num w:numId="1" w16cid:durableId="510724230">
     <w:abstractNumId w:val="0"/>
   </w:num>
-  <w:num w:numId="2">
+  <w:num w:numId="2" w16cid:durableId="2077820210">
     <w:abstractNumId w:val="1"/>
   </w:num>
 </w:numbering>
@@ -1069,7 +1129,6 @@
   <w:style w:type="character" w:default="1" w:styleId="a0">
     <w:name w:val="Default Paragraph Font"/>
     <w:uiPriority w:val="1"/>
-    <w:semiHidden/>
     <w:unhideWhenUsed/>
   </w:style>
   <w:style w:type="table" w:default="1" w:styleId="a1">
@@ -1108,6 +1167,17 @@
       <w:sz w:val="24"/>
       <w:szCs w:val="24"/>
     </w:rPr>
+  </w:style>
+  <w:style w:type="paragraph" w:styleId="a3">
+    <w:name w:val="List Paragraph"/>
+    <w:basedOn w:val="a"/>
+    <w:uiPriority w:val="34"/>
+    <w:qFormat/>
+    <w:rsid w:val="00262C0A"/>
+    <w:pPr>
+      <w:ind w:left="720"/>
+      <w:contextualSpacing/>
+    </w:pPr>
   </w:style>
 </w:styles>
 </file>

</xml_diff>